<commit_message>
docs(w4): SRS review fixes — forgot-password wording, foreman-only mobile, no history
§3.2.5 quotes the shipped forgot-password copy ('HR is not notified automatically'), not the pre-ship draft. §2.3 no longer sends all five staff roles to mobile: the foreman app is foreman-only since W3, HR/engineer/admin/executive are web-only. §3.2.5 keeps requirements only — the sign-in history and the 'can HR log in as a worker' rehearsal moved out (history to the plan file with corrected commit chain, rehearsal to QA prep §5 Q12 as property + answer).

CLAUDE.md §6 SRS entry now names the FR-11/UC-11/§3.2.5 additions. SRS.docx mirrors all three fixes. Suite on host (not container): 512 passed / 2326 assertions, 39s — confirming the 452s container time was bind-mount reads per boot, not the code.
</commit_message>
<xml_diff>
--- a/docs/SRS.docx
+++ b/docs/SRS.docx
@@ -11282,13 +11282,21 @@
         <w:pStyle w:val="4"/>
       </w:pPr>
       <w:r>
+        <w:t>Sign-in. A portal account signs in through the same login endpoint as staff. Sign-in and the portal ship together, so a worker is never logged in with nowhere to go. Portal sessions live in the tab only, never persisted for shared phones, and portal tokens expire after about 2 hours (staff web 12 hours, foreman mobile 30 days, decided server-side from role).</w:t>
+      </w:r>
+    </w:p>
+    <w:p>
+      <w:pPr>
+        <w:pStyle w:val="4"/>
+      </w:pPr>
+      <w:r>
         <w:rPr>
           <w:b/>
         </w:rPr>
-        <w:t xml:space="preserve">Sign-in. </w:t>
-      </w:r>
-      <w:r>
-        <w:t xml:space="preserve">A portal account signs in through the same login endpoint as staff. The backend opened portal sign-in one commit before the web portal and the mobile refusal landed; since W3 closed that gap, sign-in and the portal move together. Portal sessions live in the tab only, never persisted for shared phones, and portal tokens expire after about 2 hours (staff web 12 hours, foreman mobile 30 days, decided server-side from role).</w:t>
+        <w:t xml:space="preserve">Deny by default. </w:t>
+      </w:r>
+      <w:r>
+        <w:t xml:space="preserve">A Worker or Operator may reach only auth/me, auth/logout, auth/password (their own password change), me/attendance, and me/payslips. Every other authenticated route returns 403 for a portal role; one middleware enforces the allowlist by route name, and later routes are covered automatically, as proven by a route-sweep test. A separated employee of any role is refused on every request except auth/logout, so a live token cannot outlive the separation.</w:t>
       </w:r>
     </w:p>
     <w:p>
@@ -11299,10 +11307,10 @@
         <w:rPr>
           <w:b/>
         </w:rPr>
-        <w:t xml:space="preserve">Deny by default. </w:t>
-      </w:r>
-      <w:r>
-        <w:t xml:space="preserve">A Worker or Operator may reach only auth/me, auth/logout, auth/password (their own password change), me/attendance, and me/payslips. Every other authenticated route returns 403 for a portal role; one middleware enforces the allowlist by route name, and later routes are covered automatically, as proven by a route-sweep test. A separated employee of any role is refused on every request except auth/logout, so a live token cannot outlive the separation.</w:t>
+        <w:t xml:space="preserve">View-only, their own data only. </w:t>
+      </w:r>
+      <w:r>
+        <w:t xml:space="preserve">The portal shows, for the signed-in employee alone: My attendance (date, status, time in and out, how the time-out was recorded, review state in plain words; the window is optional and defaults to the current pay period, and every response carries the period block the page steps through) and My payslips (approved runs only, contributions itemised; visible once HR approves the run). There is no employee-id parameter anywhere.</w:t>
       </w:r>
     </w:p>
     <w:p>
@@ -11310,27 +11318,7 @@
         <w:pStyle w:val="4"/>
       </w:pPr>
       <w:r>
-        <w:rPr>
-          <w:b/>
-        </w:rPr>
-        <w:t xml:space="preserve">View-only, their own data only. </w:t>
-      </w:r>
-      <w:r>
-        <w:t xml:space="preserve">The portal shows, for the signed-in employee alone: My attendance (date, status, time in and out, how the time-out was recorded, review state in plain words; the window is optional and defaults to the current pay period, and every response carries the period block the page steps through) and My payslips (approved runs only, contributions itemised; visible once HR approves the run). There is no employee-id parameter anywhere.</w:t>
-      </w:r>
-    </w:p>
-    <w:p>
-      <w:pPr>
-        <w:pStyle w:val="4"/>
-      </w:pPr>
-      <w:r>
-        <w:rPr>
-          <w:b/>
-        </w:rPr>
-        <w:t xml:space="preserve">Account recovery (reset) and password change. </w:t>
-      </w:r>
-      <w:r>
-        <w:t xml:space="preserve">When access has been hijacked or must be withdrawn, HR Reset portal access sets a random temporary password and revokes the worker's tokens; the password is shown once and handed over in person, and self-activation stays refused. The worker then changes it to one of their own inside the portal (wrong-current guesses throttled per account; every other session dies, the current one survives). There is no forced rotation at first sign-in. A worker's first credential is self-set at activation; every later one comes from HR's reset, so HR can transiently log in as a worker through the reset flow, visibly and with an audit row – never by knowing a secret. No self-serve reset exists.</w:t>
+        <w:t>Account recovery (reset) and password change. When access has been hijacked or must be withdrawn, HR Reset portal access sets a random temporary password and revokes the worker's tokens; the password is shown once and handed over in person, and self-activation stays refused. The worker then changes it to one of their own inside the portal (wrong-current guesses throttled per account; every other session dies, the current one survives). There is no forced rotation at first sign-in. A worker's first credential is self-set at activation; every later one comes from HR's reset, so HR can issue a working credential for any worker only through the audited reset flow – transiently and visibly, never by knowing a secret. No self-serve reset exists.</w:t>
       </w:r>
     </w:p>
     <w:p>

</xml_diff>